<commit_message>
Support dynamic participant rows and default job text
</commit_message>
<xml_diff>
--- a/public/template.docx
+++ b/public/template.docx
@@ -382,7 +382,7 @@
         <w:gridCol w:w="1136"/>
         <w:gridCol w:w="1654"/>
         <w:gridCol w:w="1847"/>
-        <w:gridCol w:w="996"/>
+        <w:gridCol w:w="1106"/>
         <w:gridCol w:w="988"/>
         <w:gridCol w:w="1002"/>
         <w:gridCol w:w="1145"/>
@@ -830,7 +830,7 @@
                 <w:color w:val="000000"/>
                 <w:lang w:val="en-US" w:eastAsia="zh-CN"/>
               </w:rPr>
-              <w:t>开发、项目管理</w:t>
+              <w:t>{job1}</w:t>
             </w:r>
           </w:p>
         </w:tc>
@@ -1101,8 +1101,12 @@
           </w:tcPr>
           <w:p>
             <w:pPr>
-              <w:spacing w:line="240" w:lineRule="auto"/>
-              <w:ind w:firstLine="0" w:firstLineChars="0"/>
+              <w:keepNext w:val="0"/>
+              <w:keepLines w:val="0"/>
+              <w:widowControl/>
+              <w:suppressLineNumbers w:val="0"/>
+              <w:ind w:left="0" w:leftChars="0" w:firstLine="0" w:firstLineChars="0"/>
+              <w:jc w:val="left"/>
               <w:rPr>
                 <w:rFonts w:hint="default" w:ascii="宋体" w:hAnsi="宋体" w:eastAsia="宋体" w:cs="宋体"/>
                 <w:color w:val="000000"/>
@@ -1113,9 +1117,12 @@
               <w:rPr>
                 <w:rFonts w:hint="eastAsia" w:ascii="宋体" w:hAnsi="宋体" w:eastAsia="宋体" w:cs="宋体"/>
                 <w:color w:val="000000"/>
-                <w:lang w:val="en-US" w:eastAsia="zh-CN"/>
-              </w:rPr>
-              <w:t>协助开发</w:t>
+                <w:kern w:val="0"/>
+                <w:sz w:val="22"/>
+                <w:szCs w:val="22"/>
+                <w:lang w:val="en-US" w:eastAsia="zh-CN" w:bidi="ar"/>
+              </w:rPr>
+              <w:t>{job2}</w:t>
             </w:r>
           </w:p>
         </w:tc>
@@ -1391,8 +1398,12 @@
           </w:tcPr>
           <w:p>
             <w:pPr>
-              <w:spacing w:line="240" w:lineRule="auto"/>
-              <w:ind w:firstLine="0" w:firstLineChars="0"/>
+              <w:keepNext w:val="0"/>
+              <w:keepLines w:val="0"/>
+              <w:widowControl/>
+              <w:suppressLineNumbers w:val="0"/>
+              <w:ind w:left="0" w:leftChars="0" w:firstLine="0" w:firstLineChars="0"/>
+              <w:jc w:val="left"/>
               <w:rPr>
                 <w:rFonts w:hint="default" w:ascii="宋体" w:hAnsi="宋体" w:eastAsia="宋体" w:cs="宋体"/>
                 <w:color w:val="000000"/>
@@ -1403,9 +1414,12 @@
               <w:rPr>
                 <w:rFonts w:hint="eastAsia" w:ascii="宋体" w:hAnsi="宋体" w:eastAsia="宋体" w:cs="宋体"/>
                 <w:color w:val="000000"/>
-                <w:lang w:val="en-US" w:eastAsia="zh-CN"/>
-              </w:rPr>
-              <w:t>协助开发</w:t>
+                <w:kern w:val="0"/>
+                <w:sz w:val="22"/>
+                <w:szCs w:val="22"/>
+                <w:lang w:val="en-US" w:eastAsia="zh-CN" w:bidi="ar"/>
+              </w:rPr>
+              <w:t>{job3}</w:t>
             </w:r>
           </w:p>
         </w:tc>
@@ -1695,6 +1709,8 @@
       <w:pPr>
         <w:ind w:firstLine="0" w:firstLineChars="0"/>
       </w:pPr>
+      <w:bookmarkStart w:id="0" w:name="_GoBack"/>
+      <w:bookmarkEnd w:id="0"/>
     </w:p>
     <w:sectPr>
       <w:headerReference r:id="rId7" w:type="first"/>
@@ -1846,7 +1862,7 @@
   <w:docDefaults>
     <w:rPrDefault>
       <w:rPr>
-        <w:rFonts w:asciiTheme="minorHAnsi" w:hAnsiTheme="minorHAnsi" w:eastAsiaTheme="minorEastAsia" w:cstheme="minorBidi"/>
+        <w:rFonts w:ascii="Times New Roman" w:hAnsi="Times New Roman" w:eastAsia="宋体" w:cs="Times New Roman"/>
       </w:rPr>
     </w:rPrDefault>
     <w:pPrDefault/>

</xml_diff>